<commit_message>
fix(access): let delegated students open ADUC without UAC elevation
</commit_message>
<xml_diff>
--- a/docs/IA-Lab-Completion-Guide.docx
+++ b/docs/IA-Lab-Completion-Guide.docx
@@ -1154,70 +1154,212 @@
         <w:pStyle w:val="Compact"/>
       </w:pPr>
       <w:r>
-        <w:t xml:space="preserve">On the server desktop, find the</w:t>
-      </w:r>
-      <w:r>
-        <w:t xml:space="preserve"> </w:t>
-      </w:r>
-      <w:r>
-        <w:rPr>
-          <w:b/>
-        </w:rPr>
-        <w:t xml:space="preserve">Server Manager</w:t>
-      </w:r>
-      <w:r>
-        <w:t xml:space="preserve"> </w:t>
-      </w:r>
-      <w:r>
-        <w:t xml:space="preserve">window (it usually opens automatically)</w:t>
-      </w:r>
-    </w:p>
-    <w:p>
-      <w:pPr>
-        <w:numPr>
-          <w:ilvl w:val="0"/>
-          <w:numId w:val="1009"/>
+        <w:t xml:space="preserve">On the server desktop, double-click the</w:t>
+      </w:r>
+      <w:r>
+        <w:t xml:space="preserve"> </w:t>
+      </w:r>
+      <w:r>
+        <w:rPr>
+          <w:b/>
+        </w:rPr>
+        <w:t xml:space="preserve">Active Directory Users and Computers</w:t>
+      </w:r>
+      <w:r>
+        <w:t xml:space="preserve"> </w:t>
+      </w:r>
+      <w:r>
+        <w:t xml:space="preserve">shortcut.</w:t>
+      </w:r>
+    </w:p>
+    <w:p>
+      <w:pPr>
+        <w:pStyle w:val="FirstParagraph"/>
+      </w:pPr>
+      <w:r>
+        <w:rPr>
+          <w:b/>
+        </w:rPr>
+        <w:t xml:space="preserve">Important — do not launch ADUC any other way.</w:t>
+      </w:r>
+      <w:r>
+        <w:t xml:space="preserve"> </w:t>
+      </w:r>
+      <w:r>
+        <w:t xml:space="preserve">Your account administers your own pod only and is deliberately not an administrator of the shared domain controller. Launching ADUC from</w:t>
+      </w:r>
+      <w:r>
+        <w:t xml:space="preserve"> </w:t>
+      </w:r>
+      <w:r>
+        <w:rPr>
+          <w:b/>
+        </w:rPr>
+        <w:t xml:space="preserve">Server Manager → Tools</w:t>
+      </w:r>
+      <w:r>
+        <w:t xml:space="preserve">, from</w:t>
+      </w:r>
+      <w:r>
+        <w:t xml:space="preserve"> </w:t>
+      </w:r>
+      <w:r>
+        <w:rPr>
+          <w:rStyle w:val="VerbatimChar"/>
+        </w:rPr>
+        <w:t xml:space="preserve">dsa.msc</w:t>
+      </w:r>
+      <w:r>
+        <w:t xml:space="preserve">, or from a blank MMC console makes Windows try to start it elevated and show a</w:t>
+      </w:r>
+      <w:r>
+        <w:t xml:space="preserve"> </w:t>
+      </w:r>
+      <w:r>
+        <w:rPr>
+          <w:b/>
+        </w:rPr>
+        <w:t xml:space="preserve">User Account Control</w:t>
+      </w:r>
+      <w:r>
+        <w:t xml:space="preserve"> </w:t>
+      </w:r>
+      <w:r>
+        <w:t xml:space="preserve">prompt for an administrator username and password; your student account will always be rejected there. That is expected and does not mean your password is wrong — click</w:t>
+      </w:r>
+      <w:r>
+        <w:t xml:space="preserve"> </w:t>
+      </w:r>
+      <w:r>
+        <w:rPr>
+          <w:b/>
+        </w:rPr>
+        <w:t xml:space="preserve">No</w:t>
+      </w:r>
+      <w:r>
+        <w:t xml:space="preserve"> </w:t>
+      </w:r>
+      <w:r>
+        <w:t xml:space="preserve">and use the desktop shortcut. If the shortcut is missing, press</w:t>
+      </w:r>
+      <w:r>
+        <w:t xml:space="preserve"> </w:t>
+      </w:r>
+      <w:r>
+        <w:rPr>
+          <w:b/>
+        </w:rPr>
+        <w:t xml:space="preserve">Windows + R</w:t>
+      </w:r>
+      <w:r>
+        <w:t xml:space="preserve"> </w:t>
+      </w:r>
+      <w:r>
+        <w:t xml:space="preserve">and paste</w:t>
+      </w:r>
+      <w:r>
+        <w:t xml:space="preserve"> </w:t>
+      </w:r>
+      <w:r>
+        <w:rPr>
+          <w:rStyle w:val="VerbatimChar"/>
+        </w:rPr>
+        <w:t xml:space="preserve">cmd /c "set __COMPAT_LAYER=RunAsInvoker&amp;&amp; start "" mmc.exe dsa.msc"</w:t>
+      </w:r>
+      <w:r>
+        <w:t xml:space="preserve">.</w:t>
+      </w:r>
+    </w:p>
+    <w:p>
+      <w:pPr>
+        <w:pStyle w:val="BodyText"/>
+      </w:pPr>
+      <w:r>
+        <w:rPr>
+          <w:b/>
+        </w:rPr>
+        <w:t xml:space="preserve">PowerShell</w:t>
+      </w:r>
+    </w:p>
+    <w:p>
+      <w:pPr>
+        <w:numPr>
+          <w:ilvl w:val="0"/>
+          <w:numId w:val="1010"/>
         </w:numPr>
         <w:pStyle w:val="Compact"/>
       </w:pPr>
       <w:r>
-        <w:t xml:space="preserve">Click</w:t>
-      </w:r>
-      <w:r>
-        <w:t xml:space="preserve"> </w:t>
-      </w:r>
-      <w:r>
-        <w:rPr>
-          <w:b/>
-        </w:rPr>
-        <w:t xml:space="preserve">Tools</w:t>
-      </w:r>
-      <w:r>
-        <w:t xml:space="preserve"> </w:t>
-      </w:r>
-      <w:r>
-        <w:t xml:space="preserve">in the top-right menu bar</w:t>
-      </w:r>
-    </w:p>
-    <w:p>
-      <w:pPr>
-        <w:numPr>
-          <w:ilvl w:val="0"/>
-          <w:numId w:val="1009"/>
+        <w:t xml:space="preserve">Right-click the</w:t>
+      </w:r>
+      <w:r>
+        <w:t xml:space="preserve"> </w:t>
+      </w:r>
+      <w:r>
+        <w:rPr>
+          <w:b/>
+        </w:rPr>
+        <w:t xml:space="preserve">Start</w:t>
+      </w:r>
+      <w:r>
+        <w:t xml:space="preserve"> </w:t>
+      </w:r>
+      <w:r>
+        <w:t xml:space="preserve">button →</w:t>
+      </w:r>
+      <w:r>
+        <w:t xml:space="preserve"> </w:t>
+      </w:r>
+      <w:r>
+        <w:rPr>
+          <w:b/>
+        </w:rPr>
+        <w:t xml:space="preserve">Windows PowerShell</w:t>
+      </w:r>
+    </w:p>
+    <w:p>
+      <w:pPr>
+        <w:numPr>
+          <w:ilvl w:val="0"/>
+          <w:numId w:val="1010"/>
         </w:numPr>
         <w:pStyle w:val="Compact"/>
       </w:pPr>
       <w:r>
-        <w:t xml:space="preserve">Select</w:t>
-      </w:r>
-      <w:r>
-        <w:t xml:space="preserve"> </w:t>
-      </w:r>
-      <w:r>
-        <w:rPr>
-          <w:b/>
-        </w:rPr>
-        <w:t xml:space="preserve">Active Directory Users and Computers</w:t>
+        <w:rPr>
+          <w:i/>
+        </w:rPr>
+        <w:t xml:space="preserve">Alternative:</w:t>
+      </w:r>
+      <w:r>
+        <w:t xml:space="preserve"> </w:t>
+      </w:r>
+      <w:r>
+        <w:rPr>
+          <w:b/>
+        </w:rPr>
+        <w:t xml:space="preserve">Windows + R</w:t>
+      </w:r>
+      <w:r>
+        <w:t xml:space="preserve"> </w:t>
+      </w:r>
+      <w:r>
+        <w:t xml:space="preserve">→</w:t>
+      </w:r>
+      <w:r>
+        <w:t xml:space="preserve"> </w:t>
+      </w:r>
+      <w:r>
+        <w:rPr>
+          <w:b/>
+        </w:rPr>
+        <w:t xml:space="preserve">powershell</w:t>
+      </w:r>
+      <w:r>
+        <w:t xml:space="preserve"> </w:t>
+      </w:r>
+      <w:r>
+        <w:t xml:space="preserve">→ Enter</w:t>
       </w:r>
     </w:p>
     <w:p>
@@ -1225,158 +1367,39 @@
         <w:pStyle w:val="FirstParagraph"/>
       </w:pPr>
       <w:r>
-        <w:rPr>
-          <w:i/>
-        </w:rPr>
-        <w:t xml:space="preserve">Alternative:</w:t>
-      </w:r>
-      <w:r>
-        <w:t xml:space="preserve"> </w:t>
-      </w:r>
-      <w:r>
-        <w:t xml:space="preserve">press</w:t>
-      </w:r>
-      <w:r>
-        <w:t xml:space="preserve"> </w:t>
-      </w:r>
-      <w:r>
-        <w:rPr>
-          <w:b/>
-        </w:rPr>
-        <w:t xml:space="preserve">Windows + R</w:t>
-      </w:r>
-      <w:r>
-        <w:t xml:space="preserve">, type</w:t>
-      </w:r>
-      <w:r>
-        <w:t xml:space="preserve"> </w:t>
-      </w:r>
-      <w:r>
-        <w:rPr>
-          <w:rStyle w:val="VerbatimChar"/>
-        </w:rPr>
-        <w:t xml:space="preserve">dsa.msc</w:t>
-      </w:r>
-      <w:r>
-        <w:t xml:space="preserve">, press Enter.</w:t>
+        <w:t xml:space="preserve">Run PowerShell normally — do</w:t>
+      </w:r>
+      <w:r>
+        <w:t xml:space="preserve"> </w:t>
+      </w:r>
+      <w:r>
+        <w:rPr>
+          <w:b/>
+        </w:rPr>
+        <w:t xml:space="preserve">not</w:t>
+      </w:r>
+      <w:r>
+        <w:t xml:space="preserve"> </w:t>
+      </w:r>
+      <w:r>
+        <w:t xml:space="preserve">choose</w:t>
+      </w:r>
+      <w:r>
+        <w:t xml:space="preserve"> </w:t>
+      </w:r>
+      <w:r>
+        <w:rPr>
+          <w:b/>
+        </w:rPr>
+        <w:t xml:space="preserve">Windows PowerShell (Admin)</w:t>
+      </w:r>
+      <w:r>
+        <w:t xml:space="preserve">. Every command in this guide works with your own delegated permissions, and (Admin) triggers the same UAC prompt described above.</w:t>
       </w:r>
     </w:p>
     <w:p>
       <w:pPr>
         <w:pStyle w:val="BodyText"/>
-      </w:pPr>
-      <w:r>
-        <w:rPr>
-          <w:b/>
-        </w:rPr>
-        <w:t xml:space="preserve">PowerShell</w:t>
-      </w:r>
-    </w:p>
-    <w:p>
-      <w:pPr>
-        <w:numPr>
-          <w:ilvl w:val="0"/>
-          <w:numId w:val="1010"/>
-        </w:numPr>
-        <w:pStyle w:val="Compact"/>
-      </w:pPr>
-      <w:r>
-        <w:t xml:space="preserve">Right-click the</w:t>
-      </w:r>
-      <w:r>
-        <w:t xml:space="preserve"> </w:t>
-      </w:r>
-      <w:r>
-        <w:rPr>
-          <w:b/>
-        </w:rPr>
-        <w:t xml:space="preserve">Start</w:t>
-      </w:r>
-      <w:r>
-        <w:t xml:space="preserve"> </w:t>
-      </w:r>
-      <w:r>
-        <w:t xml:space="preserve">button →</w:t>
-      </w:r>
-      <w:r>
-        <w:t xml:space="preserve"> </w:t>
-      </w:r>
-      <w:r>
-        <w:rPr>
-          <w:b/>
-        </w:rPr>
-        <w:t xml:space="preserve">Windows PowerShell</w:t>
-      </w:r>
-      <w:r>
-        <w:t xml:space="preserve"> </w:t>
-      </w:r>
-      <w:r>
-        <w:t xml:space="preserve">(use</w:t>
-      </w:r>
-      <w:r>
-        <w:t xml:space="preserve"> </w:t>
-      </w:r>
-      <w:r>
-        <w:rPr>
-          <w:b/>
-        </w:rPr>
-        <w:t xml:space="preserve">(Admin)</w:t>
-      </w:r>
-      <w:r>
-        <w:t xml:space="preserve"> </w:t>
-      </w:r>
-      <w:r>
-        <w:t xml:space="preserve">where a lab says so)</w:t>
-      </w:r>
-    </w:p>
-    <w:p>
-      <w:pPr>
-        <w:numPr>
-          <w:ilvl w:val="0"/>
-          <w:numId w:val="1010"/>
-        </w:numPr>
-        <w:pStyle w:val="Compact"/>
-      </w:pPr>
-      <w:r>
-        <w:rPr>
-          <w:i/>
-        </w:rPr>
-        <w:t xml:space="preserve">Alternative:</w:t>
-      </w:r>
-      <w:r>
-        <w:t xml:space="preserve"> </w:t>
-      </w:r>
-      <w:r>
-        <w:rPr>
-          <w:b/>
-        </w:rPr>
-        <w:t xml:space="preserve">Windows + R</w:t>
-      </w:r>
-      <w:r>
-        <w:t xml:space="preserve"> </w:t>
-      </w:r>
-      <w:r>
-        <w:t xml:space="preserve">→</w:t>
-      </w:r>
-      <w:r>
-        <w:t xml:space="preserve"> </w:t>
-      </w:r>
-      <w:r>
-        <w:rPr>
-          <w:rStyle w:val="VerbatimChar"/>
-        </w:rPr>
-        <w:t xml:space="preserve">powershell</w:t>
-      </w:r>
-      <w:r>
-        <w:t xml:space="preserve"> </w:t>
-      </w:r>
-      <w:r>
-        <w:t xml:space="preserve">→ Enter</w:t>
-      </w:r>
-    </w:p>
-    <w:p>
-      <w:pPr>
-        <w:pStyle w:val="FirstParagraph"/>
       </w:pPr>
       <w:r>
         <w:rPr>
@@ -13161,34 +13184,7 @@
     </w:lvlOverride>
   </w:num>
   <w:num w:numId="1009">
-    <w:abstractNumId w:val="99211"/>
-    <w:lvlOverride w:ilvl="0">
-      <w:startOverride w:val="1"/>
-    </w:lvlOverride>
-    <w:lvlOverride w:ilvl="1">
-      <w:startOverride w:val="1"/>
-    </w:lvlOverride>
-    <w:lvlOverride w:ilvl="2">
-      <w:startOverride w:val="1"/>
-    </w:lvlOverride>
-    <w:lvlOverride w:ilvl="3">
-      <w:startOverride w:val="1"/>
-    </w:lvlOverride>
-    <w:lvlOverride w:ilvl="4">
-      <w:startOverride w:val="1"/>
-    </w:lvlOverride>
-    <w:lvlOverride w:ilvl="5">
-      <w:startOverride w:val="1"/>
-    </w:lvlOverride>
-    <w:lvlOverride w:ilvl="6">
-      <w:startOverride w:val="1"/>
-    </w:lvlOverride>
-    <w:lvlOverride w:ilvl="7">
-      <w:startOverride w:val="1"/>
-    </w:lvlOverride>
-    <w:lvlOverride w:ilvl="8">
-      <w:startOverride w:val="1"/>
-    </w:lvlOverride>
+    <w:abstractNumId w:val="991"/>
   </w:num>
   <w:num w:numId="1010">
     <w:abstractNumId w:val="99211"/>

</xml_diff>

<commit_message>
docs(guides): fix collapsed tables in generated DOCX/PDF, scope AC CMMC mapping
</commit_message>
<xml_diff>
--- a/docs/IA-Lab-Completion-Guide.docx
+++ b/docs/IA-Lab-Completion-Guide.docx
@@ -853,7 +853,8 @@
     <w:tbl>
       <w:tblPr>
         <w:tblStyle w:val="Table"/>
-        <w:tblW w:type="pct" w:w="0.0"/>
+        <w:tblW w:type="pct" w:w="5000"/>
+        <w:tblLayout w:type="autofit"/>
         <w:tblLook w:firstRow="1"/>
       </w:tblPr>
       <w:tblGrid/>
@@ -1154,70 +1155,235 @@
         <w:pStyle w:val="Compact"/>
       </w:pPr>
       <w:r>
-        <w:t xml:space="preserve">On the server desktop, find the</w:t>
-      </w:r>
-      <w:r>
-        <w:t xml:space="preserve"> </w:t>
-      </w:r>
-      <w:r>
-        <w:rPr>
-          <w:b/>
-        </w:rPr>
-        <w:t xml:space="preserve">Server Manager</w:t>
-      </w:r>
-      <w:r>
-        <w:t xml:space="preserve"> </w:t>
-      </w:r>
-      <w:r>
-        <w:t xml:space="preserve">window (it usually opens automatically)</w:t>
-      </w:r>
-    </w:p>
-    <w:p>
-      <w:pPr>
-        <w:numPr>
-          <w:ilvl w:val="0"/>
-          <w:numId w:val="1009"/>
+        <w:t xml:space="preserve">On the server desktop, double-click the</w:t>
+      </w:r>
+      <w:r>
+        <w:t xml:space="preserve"> </w:t>
+      </w:r>
+      <w:r>
+        <w:rPr>
+          <w:b/>
+        </w:rPr>
+        <w:t xml:space="preserve">Active Directory Users and Computers</w:t>
+      </w:r>
+      <w:r>
+        <w:t xml:space="preserve"> </w:t>
+      </w:r>
+      <w:r>
+        <w:t xml:space="preserve">shortcut</w:t>
+      </w:r>
+    </w:p>
+    <w:p>
+      <w:pPr>
+        <w:pStyle w:val="FirstParagraph"/>
+      </w:pPr>
+      <w:r>
+        <w:rPr>
+          <w:i/>
+        </w:rPr>
+        <w:t xml:space="preserve">Alternative:</w:t>
+      </w:r>
+      <w:r>
+        <w:t xml:space="preserve"> </w:t>
+      </w:r>
+      <w:r>
+        <w:t xml:space="preserve">press</w:t>
+      </w:r>
+      <w:r>
+        <w:t xml:space="preserve"> </w:t>
+      </w:r>
+      <w:r>
+        <w:rPr>
+          <w:b/>
+        </w:rPr>
+        <w:t xml:space="preserve">Windows + R</w:t>
+      </w:r>
+      <w:r>
+        <w:t xml:space="preserve">, type</w:t>
+      </w:r>
+      <w:r>
+        <w:t xml:space="preserve"> </w:t>
+      </w:r>
+      <w:r>
+        <w:rPr>
+          <w:rStyle w:val="VerbatimChar"/>
+        </w:rPr>
+        <w:t xml:space="preserve">dsa.msc</w:t>
+      </w:r>
+      <w:r>
+        <w:t xml:space="preserve">, press Enter.</w:t>
+      </w:r>
+    </w:p>
+    <w:p>
+      <w:pPr>
+        <w:pStyle w:val="BlockText"/>
+      </w:pPr>
+      <w:r>
+        <w:rPr>
+          <w:b/>
+        </w:rPr>
+        <w:t xml:space="preserve">Do not use Server Manager.</w:t>
+      </w:r>
+      <w:r>
+        <w:t xml:space="preserve"> </w:t>
+      </w:r>
+      <w:r>
+        <w:t xml:space="preserve">It needs administrator rights on the shared</w:t>
+      </w:r>
+      <w:r>
+        <w:t xml:space="preserve"> </w:t>
+      </w:r>
+      <w:r>
+        <w:t xml:space="preserve">server, which student accounts do not have, so it ends in</w:t>
+      </w:r>
+      <w:r>
+        <w:t xml:space="preserve"> </w:t>
+      </w:r>
+      <w:r>
+        <w:rPr>
+          <w:i/>
+        </w:rPr>
+        <w:t xml:space="preserve">"Logon failure: the</w:t>
+      </w:r>
+      <w:r>
+        <w:rPr>
+          <w:i/>
+        </w:rPr>
+        <w:t xml:space="preserve"> </w:t>
+      </w:r>
+      <w:r>
+        <w:rPr>
+          <w:i/>
+        </w:rPr>
+        <w:t xml:space="preserve">user has not been granted the requested logon type at this computer"</w:t>
+      </w:r>
+      <w:r>
+        <w:t xml:space="preserve">. Close</w:t>
+      </w:r>
+      <w:r>
+        <w:t xml:space="preserve"> </w:t>
+      </w:r>
+      <w:r>
+        <w:t xml:space="preserve">that prompt and use the desktop shortcut — your account already has the rights</w:t>
+      </w:r>
+      <w:r>
+        <w:t xml:space="preserve"> </w:t>
+      </w:r>
+      <w:r>
+        <w:t xml:space="preserve">these labs need.</w:t>
+      </w:r>
+    </w:p>
+    <w:p>
+      <w:pPr>
+        <w:pStyle w:val="FirstParagraph"/>
+      </w:pPr>
+      <w:r>
+        <w:rPr>
+          <w:b/>
+        </w:rPr>
+        <w:t xml:space="preserve">PowerShell</w:t>
+      </w:r>
+    </w:p>
+    <w:p>
+      <w:pPr>
+        <w:numPr>
+          <w:ilvl w:val="0"/>
+          <w:numId w:val="1010"/>
         </w:numPr>
         <w:pStyle w:val="Compact"/>
       </w:pPr>
       <w:r>
-        <w:t xml:space="preserve">Click</w:t>
-      </w:r>
-      <w:r>
-        <w:t xml:space="preserve"> </w:t>
-      </w:r>
-      <w:r>
-        <w:rPr>
-          <w:b/>
-        </w:rPr>
-        <w:t xml:space="preserve">Tools</w:t>
-      </w:r>
-      <w:r>
-        <w:t xml:space="preserve"> </w:t>
-      </w:r>
-      <w:r>
-        <w:t xml:space="preserve">in the top-right menu bar</w:t>
-      </w:r>
-    </w:p>
-    <w:p>
-      <w:pPr>
-        <w:numPr>
-          <w:ilvl w:val="0"/>
-          <w:numId w:val="1009"/>
+        <w:t xml:space="preserve">Right-click the</w:t>
+      </w:r>
+      <w:r>
+        <w:t xml:space="preserve"> </w:t>
+      </w:r>
+      <w:r>
+        <w:rPr>
+          <w:b/>
+        </w:rPr>
+        <w:t xml:space="preserve">Start</w:t>
+      </w:r>
+      <w:r>
+        <w:t xml:space="preserve"> </w:t>
+      </w:r>
+      <w:r>
+        <w:t xml:space="preserve">button →</w:t>
+      </w:r>
+      <w:r>
+        <w:t xml:space="preserve"> </w:t>
+      </w:r>
+      <w:r>
+        <w:rPr>
+          <w:b/>
+        </w:rPr>
+        <w:t xml:space="preserve">Windows PowerShell</w:t>
+      </w:r>
+      <w:r>
+        <w:t xml:space="preserve"> </w:t>
+      </w:r>
+      <w:r>
+        <w:t xml:space="preserve">(use</w:t>
+      </w:r>
+      <w:r>
+        <w:t xml:space="preserve"> </w:t>
+      </w:r>
+      <w:r>
+        <w:rPr>
+          <w:b/>
+        </w:rPr>
+        <w:t xml:space="preserve">(Admin)</w:t>
+      </w:r>
+      <w:r>
+        <w:t xml:space="preserve"> </w:t>
+      </w:r>
+      <w:r>
+        <w:t xml:space="preserve">where a lab says so)</w:t>
+      </w:r>
+    </w:p>
+    <w:p>
+      <w:pPr>
+        <w:numPr>
+          <w:ilvl w:val="0"/>
+          <w:numId w:val="1010"/>
         </w:numPr>
         <w:pStyle w:val="Compact"/>
       </w:pPr>
       <w:r>
-        <w:t xml:space="preserve">Select</w:t>
-      </w:r>
-      <w:r>
-        <w:t xml:space="preserve"> </w:t>
-      </w:r>
-      <w:r>
-        <w:rPr>
-          <w:b/>
-        </w:rPr>
-        <w:t xml:space="preserve">Active Directory Users and Computers</w:t>
+        <w:rPr>
+          <w:i/>
+        </w:rPr>
+        <w:t xml:space="preserve">Alternative:</w:t>
+      </w:r>
+      <w:r>
+        <w:t xml:space="preserve"> </w:t>
+      </w:r>
+      <w:r>
+        <w:rPr>
+          <w:b/>
+        </w:rPr>
+        <w:t xml:space="preserve">Windows + R</w:t>
+      </w:r>
+      <w:r>
+        <w:t xml:space="preserve"> </w:t>
+      </w:r>
+      <w:r>
+        <w:t xml:space="preserve">→</w:t>
+      </w:r>
+      <w:r>
+        <w:t xml:space="preserve"> </w:t>
+      </w:r>
+      <w:r>
+        <w:rPr>
+          <w:rStyle w:val="VerbatimChar"/>
+        </w:rPr>
+        <w:t xml:space="preserve">powershell</w:t>
+      </w:r>
+      <w:r>
+        <w:t xml:space="preserve"> </w:t>
+      </w:r>
+      <w:r>
+        <w:t xml:space="preserve">→ Enter</w:t>
       </w:r>
     </w:p>
     <w:p>
@@ -1226,19 +1392,25 @@
       </w:pPr>
       <w:r>
         <w:rPr>
-          <w:i/>
-        </w:rPr>
-        <w:t xml:space="preserve">Alternative:</w:t>
-      </w:r>
-      <w:r>
-        <w:t xml:space="preserve"> </w:t>
-      </w:r>
-      <w:r>
-        <w:t xml:space="preserve">press</w:t>
-      </w:r>
-      <w:r>
-        <w:t xml:space="preserve"> </w:t>
-      </w:r>
+          <w:b/>
+        </w:rPr>
+        <w:t xml:space="preserve">Task Scheduler</w:t>
+      </w:r>
+      <w:r>
+        <w:t xml:space="preserve"> </w:t>
+      </w:r>
+      <w:r>
+        <w:t xml:space="preserve">(needed for M2-L1)</w:t>
+      </w:r>
+    </w:p>
+    <w:p>
+      <w:pPr>
+        <w:numPr>
+          <w:ilvl w:val="0"/>
+          <w:numId w:val="1011"/>
+        </w:numPr>
+        <w:pStyle w:val="Compact"/>
+      </w:pPr>
       <w:r>
         <w:rPr>
           <w:b/>
@@ -1246,113 +1418,6 @@
         <w:t xml:space="preserve">Windows + R</w:t>
       </w:r>
       <w:r>
-        <w:t xml:space="preserve">, type</w:t>
-      </w:r>
-      <w:r>
-        <w:t xml:space="preserve"> </w:t>
-      </w:r>
-      <w:r>
-        <w:rPr>
-          <w:rStyle w:val="VerbatimChar"/>
-        </w:rPr>
-        <w:t xml:space="preserve">dsa.msc</w:t>
-      </w:r>
-      <w:r>
-        <w:t xml:space="preserve">, press Enter.</w:t>
-      </w:r>
-    </w:p>
-    <w:p>
-      <w:pPr>
-        <w:pStyle w:val="BodyText"/>
-      </w:pPr>
-      <w:r>
-        <w:rPr>
-          <w:b/>
-        </w:rPr>
-        <w:t xml:space="preserve">PowerShell</w:t>
-      </w:r>
-    </w:p>
-    <w:p>
-      <w:pPr>
-        <w:numPr>
-          <w:ilvl w:val="0"/>
-          <w:numId w:val="1010"/>
-        </w:numPr>
-        <w:pStyle w:val="Compact"/>
-      </w:pPr>
-      <w:r>
-        <w:t xml:space="preserve">Right-click the</w:t>
-      </w:r>
-      <w:r>
-        <w:t xml:space="preserve"> </w:t>
-      </w:r>
-      <w:r>
-        <w:rPr>
-          <w:b/>
-        </w:rPr>
-        <w:t xml:space="preserve">Start</w:t>
-      </w:r>
-      <w:r>
-        <w:t xml:space="preserve"> </w:t>
-      </w:r>
-      <w:r>
-        <w:t xml:space="preserve">button →</w:t>
-      </w:r>
-      <w:r>
-        <w:t xml:space="preserve"> </w:t>
-      </w:r>
-      <w:r>
-        <w:rPr>
-          <w:b/>
-        </w:rPr>
-        <w:t xml:space="preserve">Windows PowerShell</w:t>
-      </w:r>
-      <w:r>
-        <w:t xml:space="preserve"> </w:t>
-      </w:r>
-      <w:r>
-        <w:t xml:space="preserve">(use</w:t>
-      </w:r>
-      <w:r>
-        <w:t xml:space="preserve"> </w:t>
-      </w:r>
-      <w:r>
-        <w:rPr>
-          <w:b/>
-        </w:rPr>
-        <w:t xml:space="preserve">(Admin)</w:t>
-      </w:r>
-      <w:r>
-        <w:t xml:space="preserve"> </w:t>
-      </w:r>
-      <w:r>
-        <w:t xml:space="preserve">where a lab says so)</w:t>
-      </w:r>
-    </w:p>
-    <w:p>
-      <w:pPr>
-        <w:numPr>
-          <w:ilvl w:val="0"/>
-          <w:numId w:val="1010"/>
-        </w:numPr>
-        <w:pStyle w:val="Compact"/>
-      </w:pPr>
-      <w:r>
-        <w:rPr>
-          <w:i/>
-        </w:rPr>
-        <w:t xml:space="preserve">Alternative:</w:t>
-      </w:r>
-      <w:r>
-        <w:t xml:space="preserve"> </w:t>
-      </w:r>
-      <w:r>
-        <w:rPr>
-          <w:b/>
-        </w:rPr>
-        <w:t xml:space="preserve">Windows + R</w:t>
-      </w:r>
-      <w:r>
         <w:t xml:space="preserve"> </w:t>
       </w:r>
       <w:r>
@@ -1365,75 +1430,13 @@
         <w:rPr>
           <w:rStyle w:val="VerbatimChar"/>
         </w:rPr>
-        <w:t xml:space="preserve">powershell</w:t>
+        <w:t xml:space="preserve">taskschd.msc</w:t>
       </w:r>
       <w:r>
         <w:t xml:space="preserve"> </w:t>
       </w:r>
       <w:r>
         <w:t xml:space="preserve">→ Enter</w:t>
-      </w:r>
-    </w:p>
-    <w:p>
-      <w:pPr>
-        <w:pStyle w:val="FirstParagraph"/>
-      </w:pPr>
-      <w:r>
-        <w:rPr>
-          <w:b/>
-        </w:rPr>
-        <w:t xml:space="preserve">Task Scheduler</w:t>
-      </w:r>
-      <w:r>
-        <w:t xml:space="preserve"> </w:t>
-      </w:r>
-      <w:r>
-        <w:t xml:space="preserve">(needed for M2-L1)</w:t>
-      </w:r>
-    </w:p>
-    <w:p>
-      <w:pPr>
-        <w:numPr>
-          <w:ilvl w:val="0"/>
-          <w:numId w:val="1011"/>
-        </w:numPr>
-        <w:pStyle w:val="Compact"/>
-      </w:pPr>
-      <w:r>
-        <w:rPr>
-          <w:b/>
-        </w:rPr>
-        <w:t xml:space="preserve">Windows + R</w:t>
-      </w:r>
-      <w:r>
-        <w:t xml:space="preserve"> </w:t>
-      </w:r>
-      <w:r>
-        <w:t xml:space="preserve">→</w:t>
-      </w:r>
-      <w:r>
-        <w:t xml:space="preserve"> </w:t>
-      </w:r>
-      <w:r>
-        <w:rPr>
-          <w:rStyle w:val="VerbatimChar"/>
-        </w:rPr>
-        <w:t xml:space="preserve">taskschd.msc</w:t>
-      </w:r>
-      <w:r>
-        <w:t xml:space="preserve"> </w:t>
-      </w:r>
-      <w:r>
-        <w:t xml:space="preserve">→ Enter, or Server Manager →</w:t>
-      </w:r>
-      <w:r>
-        <w:t xml:space="preserve"> </w:t>
-      </w:r>
-      <w:r>
-        <w:rPr>
-          <w:b/>
-        </w:rPr>
-        <w:t xml:space="preserve">Tools → Task Scheduler</w:t>
       </w:r>
     </w:p>
     <w:p>
@@ -1541,7 +1544,8 @@
     <w:tbl>
       <w:tblPr>
         <w:tblStyle w:val="Table"/>
-        <w:tblW w:type="pct" w:w="0.0"/>
+        <w:tblW w:type="pct" w:w="5000"/>
+        <w:tblLayout w:type="autofit"/>
         <w:tblLook w:firstRow="1"/>
       </w:tblPr>
       <w:tblGrid/>
@@ -2121,7 +2125,8 @@
     <w:tbl>
       <w:tblPr>
         <w:tblStyle w:val="Table"/>
-        <w:tblW w:type="pct" w:w="0.0"/>
+        <w:tblW w:type="pct" w:w="5000"/>
+        <w:tblLayout w:type="autofit"/>
         <w:tblLook w:firstRow="1"/>
       </w:tblPr>
       <w:tblGrid/>
@@ -7511,7 +7516,8 @@
     <w:tbl>
       <w:tblPr>
         <w:tblStyle w:val="Table"/>
-        <w:tblW w:type="pct" w:w="0.0"/>
+        <w:tblW w:type="pct" w:w="5000"/>
+        <w:tblLayout w:type="autofit"/>
         <w:tblLook w:firstRow="1"/>
       </w:tblPr>
       <w:tblGrid/>
@@ -10552,7 +10558,8 @@
     <w:tbl>
       <w:tblPr>
         <w:tblStyle w:val="Table"/>
-        <w:tblW w:type="pct" w:w="0.0"/>
+        <w:tblW w:type="pct" w:w="5000"/>
+        <w:tblLayout w:type="autofit"/>
         <w:tblLook w:firstRow="1"/>
       </w:tblPr>
       <w:tblGrid/>
@@ -10852,7 +10859,8 @@
     <w:tbl>
       <w:tblPr>
         <w:tblStyle w:val="Table"/>
-        <w:tblW w:type="pct" w:w="0.0"/>
+        <w:tblW w:type="pct" w:w="5000"/>
+        <w:tblLayout w:type="autofit"/>
         <w:tblLook w:firstRow="1"/>
       </w:tblPr>
       <w:tblGrid/>
@@ -11062,7 +11070,8 @@
     <w:tbl>
       <w:tblPr>
         <w:tblStyle w:val="Table"/>
-        <w:tblW w:type="pct" w:w="0.0"/>
+        <w:tblW w:type="pct" w:w="5000"/>
+        <w:tblLayout w:type="autofit"/>
         <w:tblLook w:firstRow="1"/>
       </w:tblPr>
       <w:tblGrid/>
@@ -11562,7 +11571,8 @@
     <w:tbl>
       <w:tblPr>
         <w:tblStyle w:val="Table"/>
-        <w:tblW w:type="pct" w:w="0.0"/>
+        <w:tblW w:type="pct" w:w="5000"/>
+        <w:tblLayout w:type="autofit"/>
         <w:tblLook w:firstRow="1"/>
       </w:tblPr>
       <w:tblGrid/>
@@ -11965,7 +11975,8 @@
     <w:tbl>
       <w:tblPr>
         <w:tblStyle w:val="Table"/>
-        <w:tblW w:type="pct" w:w="0.0"/>
+        <w:tblW w:type="pct" w:w="5000"/>
+        <w:tblLayout w:type="autofit"/>
         <w:tblLook w:firstRow="1"/>
       </w:tblPr>
       <w:tblGrid/>

</xml_diff>

<commit_message>
docs(IA): require a policy-compliant 12-character password for created accounts
</commit_message>
<xml_diff>
--- a/docs/IA-Lab-Completion-Guide.docx
+++ b/docs/IA-Lab-Completion-Guide.docx
@@ -357,22 +357,46 @@
         <w:pStyle w:val="Compact"/>
       </w:pPr>
       <w:r>
-        <w:t xml:space="preserve">The</w:t>
-      </w:r>
-      <w:r>
-        <w:t xml:space="preserve"> </w:t>
-      </w:r>
-      <w:r>
-        <w:rPr>
-          <w:b/>
-        </w:rPr>
-        <w:t xml:space="preserve">lab password</w:t>
-      </w:r>
-      <w:r>
-        <w:t xml:space="preserve"> </w:t>
-      </w:r>
-      <w:r>
-        <w:t xml:space="preserve">your instructor gives you for creating new accounts</w:t>
+        <w:t xml:space="preserve">A password you choose for the accounts you create:</w:t>
+      </w:r>
+      <w:r>
+        <w:t xml:space="preserve"> </w:t>
+      </w:r>
+      <w:r>
+        <w:rPr>
+          <w:b/>
+        </w:rPr>
+        <w:t xml:space="preserve">at least 12 characters</w:t>
+      </w:r>
+      <w:r>
+        <w:t xml:space="preserve"> </w:t>
+      </w:r>
+      <w:r>
+        <w:t xml:space="preserve">with an upper-case letter, a lower-case letter, a number and a symbol (for</w:t>
+      </w:r>
+      <w:r>
+        <w:t xml:space="preserve"> </w:t>
+      </w:r>
+      <w:r>
+        <w:t xml:space="preserve">example</w:t>
+      </w:r>
+      <w:r>
+        <w:t xml:space="preserve"> </w:t>
+      </w:r>
+      <w:r>
+        <w:rPr>
+          <w:rStyle w:val="VerbatimChar"/>
+        </w:rPr>
+        <w:t xml:space="preserve">LabUser!2026#ia</w:t>
+      </w:r>
+      <w:r>
+        <w:t xml:space="preserve">). Your own sign-in password is shorter than this and</w:t>
+      </w:r>
+      <w:r>
+        <w:t xml:space="preserve"> </w:t>
+      </w:r>
+      <w:r>
+        <w:t xml:space="preserve">will be rejected</w:t>
       </w:r>
     </w:p>
     <w:p>
@@ -2980,7 +3004,25 @@
         <w:t xml:space="preserve">Next</w:t>
       </w:r>
       <w:r>
-        <w:t xml:space="preserve">, enter the lab password, uncheck</w:t>
+        <w:t xml:space="preserve">, enter a password that meets the domain policy (12+</w:t>
+      </w:r>
+      <w:r>
+        <w:t xml:space="preserve"> </w:t>
+      </w:r>
+      <w:r>
+        <w:t xml:space="preserve">characters with upper case, lower case, a number and a symbol, e.g.</w:t>
+      </w:r>
+      <w:r>
+        <w:t xml:space="preserve"> </w:t>
+      </w:r>
+      <w:r>
+        <w:rPr>
+          <w:rStyle w:val="VerbatimChar"/>
+        </w:rPr>
+        <w:t xml:space="preserve">LabUser!2026#ia</w:t>
+      </w:r>
+      <w:r>
+        <w:t xml:space="preserve">), uncheck</w:t>
       </w:r>
       <w:r>
         <w:t xml:space="preserve"> </w:t>
@@ -2992,7 +3034,13 @@
         <w:t xml:space="preserve">"User must change password at next logon"</w:t>
       </w:r>
       <w:r>
-        <w:t xml:space="preserve">, click</w:t>
+        <w:t xml:space="preserve">,</w:t>
+      </w:r>
+      <w:r>
+        <w:t xml:space="preserve"> </w:t>
+      </w:r>
+      <w:r>
+        <w:t xml:space="preserve">click</w:t>
       </w:r>
       <w:r>
         <w:t xml:space="preserve"> </w:t>
@@ -5258,7 +5306,13 @@
         <w:t xml:space="preserve">Next</w:t>
       </w:r>
       <w:r>
-        <w:t xml:space="preserve">, enter a strong password, check</w:t>
+        <w:t xml:space="preserve">, enter a password that meets the domain policy (12+</w:t>
+      </w:r>
+      <w:r>
+        <w:t xml:space="preserve"> </w:t>
+      </w:r>
+      <w:r>
+        <w:t xml:space="preserve">characters with upper case, lower case, a number and a symbol), check</w:t>
       </w:r>
       <w:r>
         <w:t xml:space="preserve"> </w:t>

</xml_diff>